<commit_message>
Note desktop control in the tester guide
The user's edit to docs/测试人员必看！.docx: '桌面控制' added to the 技能与日记
list of features, plus five blank paragraphs after the CN-Fungi note. Word also
rewrote its own members (settings/core/app/rels) — only word/document.xml carries
the actual change.

This file is shipped inside the exe bundle (Fungi/docs/测试人员必看！.docx), so a
release cut before this commit carries the older copy.
</commit_message>
<xml_diff>
--- a/docs/测试人员必看！.docx
+++ b/docs/测试人员必看！.docx
@@ -181,27 +181,14 @@
         </w:rPr>
         <w:t>GitHub地址：</w:t>
       </w:r>
-      <w:r>
-        <w:fldChar w:fldCharType="begin"/>
-      </w:r>
-      <w:r>
-        <w:instrText>HYPERLINK "https://github.com/CN-Fungi/Fungi"</w:instrText>
-      </w:r>
-      <w:r>
-        <w:rPr>
-          <w:rFonts w:hint="eastAsia"/>
-        </w:rPr>
-        <w:fldChar w:fldCharType="separate"/>
-      </w:r>
-      <w:r>
-        <w:rPr>
-          <w:rStyle w:val="ae"/>
-        </w:rPr>
-        <w:t>https://github.com/CN-Fungi/Fungi</w:t>
-      </w:r>
-      <w:r>
-        <w:fldChar w:fldCharType="end"/>
-      </w:r>
+      <w:hyperlink r:id="rId6" w:history="1">
+        <w:r>
+          <w:rPr>
+            <w:rStyle w:val="ae"/>
+          </w:rPr>
+          <w:t>https://github.com/CN-Fungi/Fungi</w:t>
+        </w:r>
+      </w:hyperlink>
     </w:p>
     <w:p>
       <w:pPr>
@@ -267,7 +254,7 @@
                     <pic:cNvPicPr/>
                   </pic:nvPicPr>
                   <pic:blipFill>
-                    <a:blip r:embed="rId6"/>
+                    <a:blip r:embed="rId7"/>
                     <a:stretch>
                       <a:fillRect/>
                     </a:stretch>
@@ -297,6 +284,11 @@
       </w:pPr>
     </w:p>
     <w:p>
+      <w:pPr>
+        <w:rPr>
+          <w:rFonts w:hint="eastAsia"/>
+        </w:rPr>
+      </w:pPr>
       <w:r>
         <w:rPr>
           <w:rFonts w:hint="eastAsia"/>
@@ -318,11 +310,41 @@
         <w:t>如果创建了GitHub仓库，可以申请加入，或者告诉我拉进去。</w:t>
       </w:r>
     </w:p>
-    <w:p/>
-    <w:p/>
-    <w:p/>
-    <w:p/>
-    <w:p/>
+    <w:p>
+      <w:pPr>
+        <w:rPr>
+          <w:rFonts w:hint="eastAsia"/>
+        </w:rPr>
+      </w:pPr>
+    </w:p>
+    <w:p>
+      <w:pPr>
+        <w:rPr>
+          <w:rFonts w:hint="eastAsia"/>
+        </w:rPr>
+      </w:pPr>
+    </w:p>
+    <w:p>
+      <w:pPr>
+        <w:rPr>
+          <w:rFonts w:hint="eastAsia"/>
+        </w:rPr>
+      </w:pPr>
+    </w:p>
+    <w:p>
+      <w:pPr>
+        <w:rPr>
+          <w:rFonts w:hint="eastAsia"/>
+        </w:rPr>
+      </w:pPr>
+    </w:p>
+    <w:p>
+      <w:pPr>
+        <w:rPr>
+          <w:rFonts w:hint="eastAsia"/>
+        </w:rPr>
+      </w:pPr>
+    </w:p>
     <w:p>
       <w:pPr>
         <w:rPr>
@@ -376,7 +398,7 @@
                     <pic:cNvPicPr/>
                   </pic:nvPicPr>
                   <pic:blipFill>
-                    <a:blip r:embed="rId7"/>
+                    <a:blip r:embed="rId8"/>
                     <a:stretch>
                       <a:fillRect/>
                     </a:stretch>
@@ -450,7 +472,7 @@
                     <pic:cNvPicPr/>
                   </pic:nvPicPr>
                   <pic:blipFill>
-                    <a:blip r:embed="rId8"/>
+                    <a:blip r:embed="rId9"/>
                     <a:stretch>
                       <a:fillRect/>
                     </a:stretch>
@@ -499,7 +521,7 @@
                     <pic:cNvPicPr/>
                   </pic:nvPicPr>
                   <pic:blipFill>
-                    <a:blip r:embed="rId9"/>
+                    <a:blip r:embed="rId10"/>
                     <a:stretch>
                       <a:fillRect/>
                     </a:stretch>
@@ -584,54 +606,6 @@
                 <pic:pic xmlns:pic="http://schemas.openxmlformats.org/drawingml/2006/picture">
                   <pic:nvPicPr>
                     <pic:cNvPr id="2046942151" name=""/>
-                    <pic:cNvPicPr/>
-                  </pic:nvPicPr>
-                  <pic:blipFill>
-                    <a:blip r:embed="rId10"/>
-                    <a:stretch>
-                      <a:fillRect/>
-                    </a:stretch>
-                  </pic:blipFill>
-                  <pic:spPr>
-                    <a:xfrm>
-                      <a:off x="0" y="0"/>
-                      <a:ext cx="5274310" cy="4937125"/>
-                    </a:xfrm>
-                    <a:prstGeom prst="rect">
-                      <a:avLst/>
-                    </a:prstGeom>
-                  </pic:spPr>
-                </pic:pic>
-              </a:graphicData>
-            </a:graphic>
-          </wp:inline>
-        </w:drawing>
-      </w:r>
-    </w:p>
-    <w:p>
-      <w:pPr>
-        <w:rPr>
-          <w:rFonts w:hint="eastAsia"/>
-        </w:rPr>
-      </w:pPr>
-      <w:r>
-        <w:rPr>
-          <w:noProof/>
-        </w:rPr>
-        <w:lastRenderedPageBreak/>
-        <w:drawing>
-          <wp:inline distT="0" distB="0" distL="0" distR="0" wp14:anchorId="471C43AE" wp14:editId="03826C2A">
-            <wp:extent cx="5274310" cy="4937125"/>
-            <wp:effectExtent l="0" t="0" r="2540" b="0"/>
-            <wp:docPr id="1419067235" name="图片 1"/>
-            <wp:cNvGraphicFramePr>
-              <a:graphicFrameLocks xmlns:a="http://schemas.openxmlformats.org/drawingml/2006/main" noChangeAspect="1"/>
-            </wp:cNvGraphicFramePr>
-            <a:graphic xmlns:a="http://schemas.openxmlformats.org/drawingml/2006/main">
-              <a:graphicData uri="http://schemas.openxmlformats.org/drawingml/2006/picture">
-                <pic:pic xmlns:pic="http://schemas.openxmlformats.org/drawingml/2006/picture">
-                  <pic:nvPicPr>
-                    <pic:cNvPr id="1419067235" name=""/>
                     <pic:cNvPicPr/>
                   </pic:nvPicPr>
                   <pic:blipFill>
@@ -662,6 +636,54 @@
           <w:rFonts w:hint="eastAsia"/>
         </w:rPr>
       </w:pPr>
+      <w:r>
+        <w:rPr>
+          <w:noProof/>
+        </w:rPr>
+        <w:lastRenderedPageBreak/>
+        <w:drawing>
+          <wp:inline distT="0" distB="0" distL="0" distR="0" wp14:anchorId="471C43AE" wp14:editId="03826C2A">
+            <wp:extent cx="5274310" cy="4937125"/>
+            <wp:effectExtent l="0" t="0" r="2540" b="0"/>
+            <wp:docPr id="1419067235" name="图片 1"/>
+            <wp:cNvGraphicFramePr>
+              <a:graphicFrameLocks xmlns:a="http://schemas.openxmlformats.org/drawingml/2006/main" noChangeAspect="1"/>
+            </wp:cNvGraphicFramePr>
+            <a:graphic xmlns:a="http://schemas.openxmlformats.org/drawingml/2006/main">
+              <a:graphicData uri="http://schemas.openxmlformats.org/drawingml/2006/picture">
+                <pic:pic xmlns:pic="http://schemas.openxmlformats.org/drawingml/2006/picture">
+                  <pic:nvPicPr>
+                    <pic:cNvPr id="1419067235" name=""/>
+                    <pic:cNvPicPr/>
+                  </pic:nvPicPr>
+                  <pic:blipFill>
+                    <a:blip r:embed="rId12"/>
+                    <a:stretch>
+                      <a:fillRect/>
+                    </a:stretch>
+                  </pic:blipFill>
+                  <pic:spPr>
+                    <a:xfrm>
+                      <a:off x="0" y="0"/>
+                      <a:ext cx="5274310" cy="4937125"/>
+                    </a:xfrm>
+                    <a:prstGeom prst="rect">
+                      <a:avLst/>
+                    </a:prstGeom>
+                  </pic:spPr>
+                </pic:pic>
+              </a:graphicData>
+            </a:graphic>
+          </wp:inline>
+        </w:drawing>
+      </w:r>
+    </w:p>
+    <w:p>
+      <w:pPr>
+        <w:rPr>
+          <w:rFonts w:hint="eastAsia"/>
+        </w:rPr>
+      </w:pPr>
     </w:p>
     <w:p>
       <w:pPr>
@@ -813,7 +835,7 @@
                     <pic:cNvPicPr/>
                   </pic:nvPicPr>
                   <pic:blipFill>
-                    <a:blip r:embed="rId12"/>
+                    <a:blip r:embed="rId13"/>
                     <a:stretch>
                       <a:fillRect/>
                     </a:stretch>
@@ -861,7 +883,7 @@
                     <pic:cNvPicPr/>
                   </pic:nvPicPr>
                   <pic:blipFill>
-                    <a:blip r:embed="rId13"/>
+                    <a:blip r:embed="rId14"/>
                     <a:stretch>
                       <a:fillRect/>
                     </a:stretch>
@@ -953,7 +975,7 @@
                     <pic:cNvPicPr/>
                   </pic:nvPicPr>
                   <pic:blipFill>
-                    <a:blip r:embed="rId14"/>
+                    <a:blip r:embed="rId15"/>
                     <a:stretch>
                       <a:fillRect/>
                     </a:stretch>
@@ -1029,7 +1051,7 @@
                     </pic:cNvPicPr>
                   </pic:nvPicPr>
                   <pic:blipFill>
-                    <a:blip r:embed="rId15" cstate="print">
+                    <a:blip r:embed="rId16" cstate="print">
                       <a:extLst>
                         <a:ext uri="{28A0092B-C50C-407E-A947-70E740481C1C}">
                           <a14:useLocalDpi xmlns:a14="http://schemas.microsoft.com/office/drawing/2010/main" val="0"/>
@@ -1181,7 +1203,7 @@
                     <pic:cNvPicPr/>
                   </pic:nvPicPr>
                   <pic:blipFill>
-                    <a:blip r:embed="rId16"/>
+                    <a:blip r:embed="rId17"/>
                     <a:stretch>
                       <a:fillRect/>
                     </a:stretch>
@@ -1300,7 +1322,7 @@
                     <pic:cNvPicPr/>
                   </pic:nvPicPr>
                   <pic:blipFill>
-                    <a:blip r:embed="rId17"/>
+                    <a:blip r:embed="rId18"/>
                     <a:stretch>
                       <a:fillRect/>
                     </a:stretch>
@@ -1332,21 +1354,7 @@
           <w:rFonts w:hint="eastAsia"/>
         </w:rPr>
         <w:lastRenderedPageBreak/>
-        <w:t>发起或加入房间后，点击下方“打开</w:t>
-      </w:r>
-      <w:proofErr w:type="spellStart"/>
-      <w:r>
-        <w:rPr>
-          <w:rFonts w:hint="eastAsia"/>
-        </w:rPr>
-        <w:t>WebUI</w:t>
-      </w:r>
-      <w:proofErr w:type="spellEnd"/>
-      <w:r>
-        <w:rPr>
-          <w:rFonts w:hint="eastAsia"/>
-        </w:rPr>
-        <w:t>”即可进入网页：</w:t>
+        <w:t>发起或加入房间后，点击下方“打开WebUI”即可进入网页：</w:t>
       </w:r>
     </w:p>
     <w:p>
@@ -1360,7 +1368,7 @@
           <w:noProof/>
         </w:rPr>
         <w:drawing>
-          <wp:inline distT="0" distB="0" distL="0" distR="0" wp14:anchorId="049B5030" wp14:editId="00BDA4F3">
+          <wp:inline distT="0" distB="0" distL="0" distR="0" wp14:anchorId="049B5030" wp14:editId="7A51CA0D">
             <wp:extent cx="5274310" cy="3378835"/>
             <wp:effectExtent l="0" t="0" r="2540" b="0"/>
             <wp:docPr id="554474087" name="图片 3"/>
@@ -1377,7 +1385,7 @@
                     </pic:cNvPicPr>
                   </pic:nvPicPr>
                   <pic:blipFill>
-                    <a:blip r:embed="rId18" cstate="print">
+                    <a:blip r:embed="rId19" cstate="print">
                       <a:extLst>
                         <a:ext uri="{28A0092B-C50C-407E-A947-70E740481C1C}">
                           <a14:useLocalDpi xmlns:a14="http://schemas.microsoft.com/office/drawing/2010/main" val="0"/>
@@ -1473,7 +1481,7 @@
                     <pic:cNvPicPr/>
                   </pic:nvPicPr>
                   <pic:blipFill>
-                    <a:blip r:embed="rId19"/>
+                    <a:blip r:embed="rId20"/>
                     <a:stretch>
                       <a:fillRect/>
                     </a:stretch>
@@ -1553,27 +1561,14 @@
         </w:rPr>
         <w:t>创建API：</w:t>
       </w:r>
-      <w:r>
-        <w:fldChar w:fldCharType="begin"/>
-      </w:r>
-      <w:r>
-        <w:instrText>HYPERLINK "https://platform.deepseek.com/api_keys"</w:instrText>
-      </w:r>
-      <w:r>
-        <w:rPr>
-          <w:rFonts w:hint="eastAsia"/>
-        </w:rPr>
-        <w:fldChar w:fldCharType="separate"/>
-      </w:r>
-      <w:r>
-        <w:rPr>
-          <w:rStyle w:val="ae"/>
-        </w:rPr>
-        <w:t>https://platform.deepseek.com/api_keys</w:t>
-      </w:r>
-      <w:r>
-        <w:fldChar w:fldCharType="end"/>
-      </w:r>
+      <w:hyperlink r:id="rId21" w:history="1">
+        <w:r>
+          <w:rPr>
+            <w:rStyle w:val="ae"/>
+          </w:rPr>
+          <w:t>https://platform.deepseek.com/api_keys</w:t>
+        </w:r>
+      </w:hyperlink>
     </w:p>
     <w:p>
       <w:pPr>
@@ -1601,7 +1596,7 @@
                     <pic:cNvPicPr/>
                   </pic:nvPicPr>
                   <pic:blipFill>
-                    <a:blip r:embed="rId20"/>
+                    <a:blip r:embed="rId22"/>
                     <a:stretch>
                       <a:fillRect/>
                     </a:stretch>
@@ -1672,7 +1667,7 @@
                     <pic:cNvPicPr/>
                   </pic:nvPicPr>
                   <pic:blipFill>
-                    <a:blip r:embed="rId21"/>
+                    <a:blip r:embed="rId23"/>
                     <a:stretch>
                       <a:fillRect/>
                     </a:stretch>
@@ -1799,7 +1794,7 @@
                     <pic:cNvPicPr/>
                   </pic:nvPicPr>
                   <pic:blipFill>
-                    <a:blip r:embed="rId22"/>
+                    <a:blip r:embed="rId24"/>
                     <a:stretch>
                       <a:fillRect/>
                     </a:stretch>
@@ -1876,7 +1871,7 @@
                     <pic:cNvPicPr/>
                   </pic:nvPicPr>
                   <pic:blipFill>
-                    <a:blip r:embed="rId23"/>
+                    <a:blip r:embed="rId25"/>
                     <a:stretch>
                       <a:fillRect/>
                     </a:stretch>
@@ -1939,20 +1934,12 @@
           <w:bCs/>
         </w:rPr>
       </w:pPr>
-      <w:proofErr w:type="spellStart"/>
       <w:r>
         <w:rPr>
           <w:rFonts w:hint="eastAsia"/>
         </w:rPr>
         <w:lastRenderedPageBreak/>
-        <w:t>Deepseek</w:t>
-      </w:r>
-      <w:proofErr w:type="spellEnd"/>
-      <w:r>
-        <w:rPr>
-          <w:rFonts w:hint="eastAsia"/>
-        </w:rPr>
-        <w:t>接口地址（Endpoint）</w:t>
+        <w:t>Deepseek接口地址（Endpoint）</w:t>
       </w:r>
       <w:r>
         <w:rPr>
@@ -2157,7 +2144,7 @@
                     <pic:cNvPicPr/>
                   </pic:nvPicPr>
                   <pic:blipFill>
-                    <a:blip r:embed="rId24"/>
+                    <a:blip r:embed="rId26"/>
                     <a:stretch>
                       <a:fillRect/>
                     </a:stretch>
@@ -2334,15 +2321,30 @@
           <w:ilvl w:val="0"/>
           <w:numId w:val="5"/>
         </w:numPr>
-        <w:rPr>
-          <w:rFonts w:hint="eastAsia"/>
-        </w:rPr>
       </w:pPr>
       <w:r>
         <w:rPr>
           <w:rFonts w:hint="eastAsia"/>
         </w:rPr>
         <w:t>技能与日记</w:t>
+      </w:r>
+    </w:p>
+    <w:p>
+      <w:pPr>
+        <w:pStyle w:val="a9"/>
+        <w:numPr>
+          <w:ilvl w:val="0"/>
+          <w:numId w:val="5"/>
+        </w:numPr>
+        <w:rPr>
+          <w:rFonts w:hint="eastAsia"/>
+        </w:rPr>
+      </w:pPr>
+      <w:r>
+        <w:rPr>
+          <w:rFonts w:hint="eastAsia"/>
+        </w:rPr>
+        <w:t>桌面控制</w:t>
       </w:r>
     </w:p>
     <w:p>
@@ -3187,21 +3189,7 @@
         <w:rPr>
           <w:rFonts w:hint="eastAsia"/>
         </w:rPr>
-        <w:t>长期记忆为“我叫</w:t>
-      </w:r>
-      <w:proofErr w:type="spellStart"/>
-      <w:r>
-        <w:rPr>
-          <w:rFonts w:hint="eastAsia"/>
-        </w:rPr>
-        <w:t>Blinvo</w:t>
-      </w:r>
-      <w:proofErr w:type="spellEnd"/>
-      <w:r>
-        <w:rPr>
-          <w:rFonts w:hint="eastAsia"/>
-        </w:rPr>
-        <w:t>，在天津理工大学上大三，今年19岁”</w:t>
+        <w:t>长期记忆为“我叫Blinvo，在天津理工大学上大三，今年19岁”</w:t>
       </w:r>
     </w:p>
     <w:p>
@@ -3466,7 +3454,7 @@
                     <pic:cNvPicPr/>
                   </pic:nvPicPr>
                   <pic:blipFill>
-                    <a:blip r:embed="rId25"/>
+                    <a:blip r:embed="rId27"/>
                     <a:stretch>
                       <a:fillRect/>
                     </a:stretch>

</xml_diff>

<commit_message>
Add the desktop-control case to the tester guide
Two tests, in the user's words: have the agent open WeChat and send a friend a
message, and have it create a text document and type a paragraph into it.
</commit_message>
<xml_diff>
--- a/docs/测试人员必看！.docx
+++ b/docs/测试人员必看！.docx
@@ -1253,14 +1253,7 @@
         <w:rPr>
           <w:rFonts w:hint="eastAsia"/>
         </w:rPr>
-        <w:t>如果发起后网络环境发生</w:t>
-      </w:r>
-      <w:proofErr w:type="gramStart"/>
-      <w:r>
-        <w:rPr>
-          <w:rFonts w:hint="eastAsia"/>
-        </w:rPr>
-        <w:t>变化</w:t>
+        <w:t>如果发起后网络环境发生变化</w:t>
       </w:r>
       <w:r>
         <w:rPr>
@@ -1268,19 +1261,11 @@
         </w:rPr>
         <w:t>,</w:t>
       </w:r>
-      <w:proofErr w:type="gramEnd"/>
-      <w:r>
-        <w:rPr>
-          <w:rFonts w:hint="eastAsia"/>
-        </w:rPr>
-        <w:t>可以刷新IP再</w:t>
-      </w:r>
-      <w:proofErr w:type="gramStart"/>
-      <w:r>
-        <w:rPr>
-          <w:rFonts w:hint="eastAsia"/>
-        </w:rPr>
-        <w:t>试</w:t>
+      <w:r>
+        <w:rPr>
+          <w:rFonts w:hint="eastAsia"/>
+        </w:rPr>
+        <w:t>可以刷新IP再试</w:t>
       </w:r>
       <w:r>
         <w:rPr>
@@ -1288,7 +1273,6 @@
         </w:rPr>
         <w:t>)</w:t>
       </w:r>
-      <w:proofErr w:type="gramEnd"/>
       <w:r>
         <w:rPr>
           <w:rFonts w:hint="eastAsia"/>
@@ -1368,7 +1352,7 @@
           <w:noProof/>
         </w:rPr>
         <w:drawing>
-          <wp:inline distT="0" distB="0" distL="0" distR="0" wp14:anchorId="049B5030" wp14:editId="7A51CA0D">
+          <wp:inline distT="0" distB="0" distL="0" distR="0" wp14:anchorId="049B5030" wp14:editId="576A3C90">
             <wp:extent cx="5274310" cy="3378835"/>
             <wp:effectExtent l="0" t="0" r="2540" b="0"/>
             <wp:docPr id="554474087" name="图片 3"/>
@@ -2321,6 +2305,9 @@
           <w:ilvl w:val="0"/>
           <w:numId w:val="5"/>
         </w:numPr>
+        <w:rPr>
+          <w:rFonts w:hint="eastAsia"/>
+        </w:rPr>
       </w:pPr>
       <w:r>
         <w:rPr>
@@ -3109,9 +3096,34 @@
         </w:rPr>
         <w:t>（问题列表）。</w:t>
       </w:r>
-      <w:r>
-        <w:br/>
-      </w:r>
+    </w:p>
+    <w:p>
+      <w:pPr>
+        <w:rPr>
+          <w:rFonts w:hint="eastAsia"/>
+        </w:rPr>
+      </w:pPr>
+    </w:p>
+    <w:p>
+      <w:pPr>
+        <w:rPr>
+          <w:rFonts w:hint="eastAsia"/>
+        </w:rPr>
+      </w:pPr>
+    </w:p>
+    <w:p>
+      <w:pPr>
+        <w:rPr>
+          <w:rFonts w:hint="eastAsia"/>
+        </w:rPr>
+      </w:pPr>
+    </w:p>
+    <w:p>
+      <w:pPr>
+        <w:rPr>
+          <w:rFonts w:hint="eastAsia"/>
+        </w:rPr>
+      </w:pPr>
     </w:p>
     <w:p>
       <w:pPr>
@@ -3128,236 +3140,89 @@
         <w:rPr>
           <w:rFonts w:hint="eastAsia"/>
         </w:rPr>
-        <w:t>消息转告流</w:t>
-      </w:r>
-    </w:p>
-    <w:p>
-      <w:pPr>
-        <w:rPr>
-          <w:rFonts w:hint="eastAsia"/>
-        </w:rPr>
-      </w:pPr>
-      <w:r>
-        <w:rPr>
-          <w:rFonts w:hint="eastAsia"/>
-        </w:rPr>
-        <w:t>一方开好房间，另一方加入房间。试着让其中一方</w:t>
-      </w:r>
-      <w:r>
-        <w:rPr>
-          <w:rFonts w:hint="eastAsia"/>
-          <w:b/>
-          <w:bCs/>
-        </w:rPr>
-        <w:t>设置好长期记忆和待办事项</w:t>
-      </w:r>
-      <w:r>
-        <w:rPr>
-          <w:rFonts w:hint="eastAsia"/>
-        </w:rPr>
-        <w:t>，另一方询问相关信息 ，看长期记忆和待办事项是否起效。</w:t>
-      </w:r>
-    </w:p>
-    <w:p>
-      <w:pPr>
-        <w:rPr>
-          <w:rFonts w:hint="eastAsia"/>
-        </w:rPr>
-      </w:pPr>
-    </w:p>
-    <w:p>
-      <w:pPr>
-        <w:rPr>
-          <w:rFonts w:hint="eastAsia"/>
-        </w:rPr>
-      </w:pPr>
-      <w:r>
-        <w:rPr>
-          <w:rFonts w:hint="eastAsia"/>
-        </w:rPr>
         <w:lastRenderedPageBreak/>
-        <w:t>比如说：</w:t>
-      </w:r>
-    </w:p>
-    <w:p>
-      <w:pPr>
-        <w:rPr>
-          <w:rFonts w:hint="eastAsia"/>
-        </w:rPr>
-      </w:pPr>
-      <w:r>
-        <w:rPr>
-          <w:rFonts w:hint="eastAsia"/>
-        </w:rPr>
-        <w:t>长期记忆为“我叫Blinvo，在天津理工大学上大三，今年19岁”</w:t>
-      </w:r>
-    </w:p>
-    <w:p>
-      <w:pPr>
-        <w:rPr>
-          <w:rFonts w:hint="eastAsia"/>
-        </w:rPr>
-      </w:pPr>
-      <w:r>
-        <w:rPr>
-          <w:rFonts w:hint="eastAsia"/>
-        </w:rPr>
-        <w:t>待办事项为“下周二去B309听魏老师上计算机网络课”。</w:t>
-      </w:r>
-    </w:p>
-    <w:p>
-      <w:pPr>
-        <w:rPr>
-          <w:rFonts w:hint="eastAsia"/>
-        </w:rPr>
-      </w:pPr>
-    </w:p>
-    <w:p>
-      <w:pPr>
-        <w:rPr>
-          <w:rFonts w:hint="eastAsia"/>
-        </w:rPr>
-      </w:pPr>
-      <w:r>
-        <w:rPr>
-          <w:rFonts w:hint="eastAsia"/>
-        </w:rPr>
-        <w:t>另一方询问：</w:t>
-      </w:r>
-    </w:p>
-    <w:p>
-      <w:pPr>
-        <w:rPr>
-          <w:rFonts w:hint="eastAsia"/>
-        </w:rPr>
-      </w:pPr>
-      <w:r>
-        <w:rPr>
-          <w:rFonts w:hint="eastAsia"/>
-        </w:rPr>
-        <w:t>“你好，请问你叫什么名字？”</w:t>
-      </w:r>
-    </w:p>
-    <w:p>
-      <w:pPr>
-        <w:rPr>
-          <w:rFonts w:hint="eastAsia"/>
-        </w:rPr>
-      </w:pPr>
-      <w:r>
-        <w:rPr>
-          <w:rFonts w:hint="eastAsia"/>
-        </w:rPr>
-        <w:t>“下周二有空一起出去玩吗？”</w:t>
-      </w:r>
-    </w:p>
-    <w:p>
-      <w:pPr>
-        <w:rPr>
-          <w:rFonts w:hint="eastAsia"/>
-        </w:rPr>
-      </w:pPr>
-      <w:r>
-        <w:rPr>
-          <w:rFonts w:hint="eastAsia"/>
-        </w:rPr>
-        <w:t>“那周三一起出去怎么样？”</w:t>
-      </w:r>
-    </w:p>
-    <w:p>
-      <w:pPr>
-        <w:rPr>
-          <w:rFonts w:hint="eastAsia"/>
-        </w:rPr>
-      </w:pPr>
-    </w:p>
-    <w:p>
-      <w:pPr>
-        <w:rPr>
-          <w:rFonts w:hint="eastAsia"/>
-        </w:rPr>
-      </w:pPr>
-      <w:r>
-        <w:rPr>
-          <w:rFonts w:hint="eastAsia"/>
-        </w:rPr>
-        <w:t>理想的状况是，信使会自动回复，</w:t>
-      </w:r>
-      <w:r>
-        <w:rPr>
-          <w:rFonts w:hint="eastAsia"/>
-          <w:b/>
-          <w:bCs/>
-        </w:rPr>
-        <w:t>告诉来信人主人的名字，明天没空，后天可以约</w:t>
-      </w:r>
-      <w:r>
-        <w:rPr>
-          <w:rFonts w:hint="eastAsia"/>
-        </w:rPr>
-        <w:t>。</w:t>
-      </w:r>
-    </w:p>
-    <w:p>
-      <w:pPr>
-        <w:rPr>
-          <w:rFonts w:hint="eastAsia"/>
-        </w:rPr>
-      </w:pPr>
-      <w:r>
-        <w:rPr>
-          <w:rFonts w:hint="eastAsia"/>
-        </w:rPr>
-        <w:t>之后信使会主动确定周三</w:t>
-      </w:r>
-      <w:r>
-        <w:rPr>
-          <w:rFonts w:hint="eastAsia"/>
-          <w:b/>
-          <w:bCs/>
-        </w:rPr>
-        <w:t>具体什么时候，去哪儿玩，以及玩什么</w:t>
-      </w:r>
-      <w:r>
-        <w:rPr>
-          <w:rFonts w:hint="eastAsia"/>
-        </w:rPr>
-        <w:t>。</w:t>
-      </w:r>
-    </w:p>
-    <w:p>
-      <w:pPr>
-        <w:rPr>
-          <w:rFonts w:hint="eastAsia"/>
-        </w:rPr>
-      </w:pPr>
-      <w:r>
-        <w:rPr>
-          <w:rFonts w:hint="eastAsia"/>
-        </w:rPr>
-        <w:t>最后信使会将周三的日程</w:t>
-      </w:r>
-      <w:r>
-        <w:rPr>
-          <w:rFonts w:hint="eastAsia"/>
-          <w:b/>
-          <w:bCs/>
-        </w:rPr>
-        <w:t>记入待办事项</w:t>
-      </w:r>
-      <w:r>
-        <w:rPr>
-          <w:rFonts w:hint="eastAsia"/>
-        </w:rPr>
-        <w:t>中，可以在日历中查看。</w:t>
-      </w:r>
-    </w:p>
-    <w:p>
-      <w:pPr>
-        <w:rPr>
-          <w:rFonts w:hint="eastAsia"/>
-        </w:rPr>
-      </w:pPr>
+        <w:t>桌面控制</w:t>
+      </w:r>
+    </w:p>
+    <w:p>
+      <w:pPr>
+        <w:rPr>
+          <w:rFonts w:hint="eastAsia"/>
+        </w:rPr>
+      </w:pPr>
+      <w:r>
+        <w:rPr>
+          <w:rFonts w:hint="eastAsia"/>
+        </w:rPr>
+        <w:t>主要分为</w:t>
+      </w:r>
+      <w:r>
+        <w:rPr>
+          <w:rFonts w:hint="eastAsia"/>
+          <w:b/>
+          <w:bCs/>
+        </w:rPr>
+        <w:t>点击和输入</w:t>
+      </w:r>
+      <w:r>
+        <w:rPr>
+          <w:rFonts w:hint="eastAsia"/>
+        </w:rPr>
+        <w:t>两种功能</w:t>
+      </w:r>
+      <w:r>
+        <w:rPr>
+          <w:rFonts w:hint="eastAsia"/>
+        </w:rPr>
+        <w:t>，可以设计</w:t>
+      </w:r>
+    </w:p>
+    <w:p>
+      <w:pPr>
+        <w:rPr>
+          <w:rFonts w:hint="eastAsia"/>
+        </w:rPr>
+      </w:pPr>
+      <w:r>
+        <w:rPr>
+          <w:rFonts w:hint="eastAsia"/>
+        </w:rPr>
+        <w:t>测试一</w:t>
+      </w:r>
+      <w:r>
+        <w:rPr>
+          <w:rFonts w:hint="eastAsia"/>
+        </w:rPr>
+        <w:t>：</w:t>
+      </w:r>
+      <w:r>
+        <w:rPr>
+          <w:rFonts w:hint="eastAsia"/>
+        </w:rPr>
+        <w:t>让Agent点开微信，给好友发送消息</w:t>
+      </w:r>
+      <w:r>
+        <w:rPr>
+          <w:rFonts w:hint="eastAsia"/>
+        </w:rPr>
+        <w:t>；</w:t>
+      </w:r>
+    </w:p>
+    <w:p>
+      <w:pPr>
+        <w:rPr>
+          <w:rFonts w:hint="eastAsia"/>
+        </w:rPr>
+      </w:pPr>
+      <w:r>
+        <w:rPr>
+          <w:rFonts w:hint="eastAsia"/>
+        </w:rPr>
+        <w:t>测试二：让Agent新建文本文档，并在里面输入一段文字。</w:t>
+      </w:r>
+      <w:r>
+        <w:br/>
+      </w:r>
     </w:p>
     <w:p>
       <w:pPr>
@@ -3374,6 +3239,251 @@
         <w:rPr>
           <w:rFonts w:hint="eastAsia"/>
         </w:rPr>
+        <w:t>消息转告流</w:t>
+      </w:r>
+    </w:p>
+    <w:p>
+      <w:pPr>
+        <w:rPr>
+          <w:rFonts w:hint="eastAsia"/>
+        </w:rPr>
+      </w:pPr>
+      <w:r>
+        <w:rPr>
+          <w:rFonts w:hint="eastAsia"/>
+        </w:rPr>
+        <w:t>一方开好房间，另一方加入房间。试着让其中一方</w:t>
+      </w:r>
+      <w:r>
+        <w:rPr>
+          <w:rFonts w:hint="eastAsia"/>
+          <w:b/>
+          <w:bCs/>
+        </w:rPr>
+        <w:t>设置好长期记忆和待办事项</w:t>
+      </w:r>
+      <w:r>
+        <w:rPr>
+          <w:rFonts w:hint="eastAsia"/>
+        </w:rPr>
+        <w:t>，另一方询问相关信息 ，看长期记忆和待办事项是否起效。</w:t>
+      </w:r>
+    </w:p>
+    <w:p>
+      <w:pPr>
+        <w:rPr>
+          <w:rFonts w:hint="eastAsia"/>
+        </w:rPr>
+      </w:pPr>
+    </w:p>
+    <w:p>
+      <w:pPr>
+        <w:rPr>
+          <w:rFonts w:hint="eastAsia"/>
+        </w:rPr>
+      </w:pPr>
+      <w:r>
+        <w:rPr>
+          <w:rFonts w:hint="eastAsia"/>
+        </w:rPr>
+        <w:t>比如说：</w:t>
+      </w:r>
+    </w:p>
+    <w:p>
+      <w:pPr>
+        <w:rPr>
+          <w:rFonts w:hint="eastAsia"/>
+        </w:rPr>
+      </w:pPr>
+      <w:r>
+        <w:rPr>
+          <w:rFonts w:hint="eastAsia"/>
+        </w:rPr>
+        <w:t>长期记忆为“我叫Blinvo，在天津理工大学上大三，今年19岁”</w:t>
+      </w:r>
+    </w:p>
+    <w:p>
+      <w:pPr>
+        <w:rPr>
+          <w:rFonts w:hint="eastAsia"/>
+        </w:rPr>
+      </w:pPr>
+      <w:r>
+        <w:rPr>
+          <w:rFonts w:hint="eastAsia"/>
+        </w:rPr>
+        <w:t>待办事项为“下周二去B309听魏老师上计算机网络课”。</w:t>
+      </w:r>
+    </w:p>
+    <w:p>
+      <w:pPr>
+        <w:rPr>
+          <w:rFonts w:hint="eastAsia"/>
+        </w:rPr>
+      </w:pPr>
+    </w:p>
+    <w:p>
+      <w:pPr>
+        <w:rPr>
+          <w:rFonts w:hint="eastAsia"/>
+        </w:rPr>
+      </w:pPr>
+      <w:r>
+        <w:rPr>
+          <w:rFonts w:hint="eastAsia"/>
+        </w:rPr>
+        <w:t>另一方询问：</w:t>
+      </w:r>
+    </w:p>
+    <w:p>
+      <w:pPr>
+        <w:rPr>
+          <w:rFonts w:hint="eastAsia"/>
+        </w:rPr>
+      </w:pPr>
+      <w:r>
+        <w:rPr>
+          <w:rFonts w:hint="eastAsia"/>
+        </w:rPr>
+        <w:t>“你好，请问你叫什么名字？”</w:t>
+      </w:r>
+    </w:p>
+    <w:p>
+      <w:pPr>
+        <w:rPr>
+          <w:rFonts w:hint="eastAsia"/>
+        </w:rPr>
+      </w:pPr>
+      <w:r>
+        <w:rPr>
+          <w:rFonts w:hint="eastAsia"/>
+        </w:rPr>
+        <w:t>“下周二有空一起出去玩吗？”</w:t>
+      </w:r>
+    </w:p>
+    <w:p>
+      <w:pPr>
+        <w:rPr>
+          <w:rFonts w:hint="eastAsia"/>
+        </w:rPr>
+      </w:pPr>
+      <w:r>
+        <w:rPr>
+          <w:rFonts w:hint="eastAsia"/>
+        </w:rPr>
+        <w:t>“那周三一起出去怎么样？”</w:t>
+      </w:r>
+    </w:p>
+    <w:p>
+      <w:pPr>
+        <w:rPr>
+          <w:rFonts w:hint="eastAsia"/>
+        </w:rPr>
+      </w:pPr>
+    </w:p>
+    <w:p>
+      <w:pPr>
+        <w:rPr>
+          <w:rFonts w:hint="eastAsia"/>
+        </w:rPr>
+      </w:pPr>
+      <w:r>
+        <w:rPr>
+          <w:rFonts w:hint="eastAsia"/>
+        </w:rPr>
+        <w:t>理想的状况是，信使会自动回复，</w:t>
+      </w:r>
+      <w:r>
+        <w:rPr>
+          <w:rFonts w:hint="eastAsia"/>
+          <w:b/>
+          <w:bCs/>
+        </w:rPr>
+        <w:t>告诉来信人主人的名字，明天没空，后天可以约</w:t>
+      </w:r>
+      <w:r>
+        <w:rPr>
+          <w:rFonts w:hint="eastAsia"/>
+        </w:rPr>
+        <w:t>。</w:t>
+      </w:r>
+    </w:p>
+    <w:p>
+      <w:pPr>
+        <w:rPr>
+          <w:rFonts w:hint="eastAsia"/>
+        </w:rPr>
+      </w:pPr>
+      <w:r>
+        <w:rPr>
+          <w:rFonts w:hint="eastAsia"/>
+        </w:rPr>
+        <w:t>之后信使会主动确定周三</w:t>
+      </w:r>
+      <w:r>
+        <w:rPr>
+          <w:rFonts w:hint="eastAsia"/>
+          <w:b/>
+          <w:bCs/>
+        </w:rPr>
+        <w:t>具体什么时候，去哪儿玩，以及玩什么</w:t>
+      </w:r>
+      <w:r>
+        <w:rPr>
+          <w:rFonts w:hint="eastAsia"/>
+        </w:rPr>
+        <w:t>。</w:t>
+      </w:r>
+    </w:p>
+    <w:p>
+      <w:pPr>
+        <w:rPr>
+          <w:rFonts w:hint="eastAsia"/>
+        </w:rPr>
+      </w:pPr>
+      <w:r>
+        <w:rPr>
+          <w:rFonts w:hint="eastAsia"/>
+        </w:rPr>
+        <w:t>最后信使会将周三的日程</w:t>
+      </w:r>
+      <w:r>
+        <w:rPr>
+          <w:rFonts w:hint="eastAsia"/>
+          <w:b/>
+          <w:bCs/>
+        </w:rPr>
+        <w:t>记入待办事项</w:t>
+      </w:r>
+      <w:r>
+        <w:rPr>
+          <w:rFonts w:hint="eastAsia"/>
+        </w:rPr>
+        <w:t>中，可以在日历中查看。</w:t>
+      </w:r>
+    </w:p>
+    <w:p>
+      <w:pPr>
+        <w:rPr>
+          <w:rFonts w:hint="eastAsia"/>
+        </w:rPr>
+      </w:pPr>
+    </w:p>
+    <w:p>
+      <w:pPr>
+        <w:pStyle w:val="a9"/>
+        <w:numPr>
+          <w:ilvl w:val="0"/>
+          <w:numId w:val="6"/>
+        </w:numPr>
+        <w:rPr>
+          <w:rFonts w:hint="eastAsia"/>
+        </w:rPr>
+      </w:pPr>
+      <w:r>
+        <w:rPr>
+          <w:rFonts w:hint="eastAsia"/>
+        </w:rPr>
         <w:t>文件传输流</w:t>
       </w:r>
     </w:p>
@@ -3438,6 +3548,7 @@
         <w:rPr>
           <w:noProof/>
         </w:rPr>
+        <w:lastRenderedPageBreak/>
         <w:drawing>
           <wp:inline distT="0" distB="0" distL="0" distR="0" wp14:anchorId="42F1C4D7" wp14:editId="0879DFF2">
             <wp:extent cx="5274310" cy="2985770"/>
@@ -3492,7 +3603,6 @@
         <w:rPr>
           <w:rFonts w:hint="eastAsia"/>
         </w:rPr>
-        <w:lastRenderedPageBreak/>
         <w:t>询问模式下，信使会发送“是否允许”的卡片</w:t>
       </w:r>
       <w:r>

</xml_diff>

<commit_message>
docs: the GhostWorld story and the tester guide (written by the user)
README.md gains 在元宇宙里一起畅游吧！ and links the game; the tester guide turns
视频理解 into a 拓展性功能 beside a new Ghostworld角色控制 entry, with the repo
link, what to download and the line to try.
</commit_message>
<xml_diff>
--- a/docs/测试人员必看！.docx
+++ b/docs/测试人员必看！.docx
@@ -181,14 +181,27 @@
         </w:rPr>
         <w:t>GitHub地址：</w:t>
       </w:r>
-      <w:hyperlink r:id="rId6" w:history="1">
-        <w:r>
-          <w:rPr>
-            <w:rStyle w:val="ae"/>
-          </w:rPr>
-          <w:t>https://github.com/CN-Fungi/Fungi</w:t>
-        </w:r>
-      </w:hyperlink>
+      <w:r>
+        <w:fldChar w:fldCharType="begin"/>
+      </w:r>
+      <w:r>
+        <w:instrText>HYPERLINK "https://github.com/CN-Fungi/Fungi"</w:instrText>
+      </w:r>
+      <w:r>
+        <w:rPr>
+          <w:rFonts w:hint="eastAsia"/>
+        </w:rPr>
+        <w:fldChar w:fldCharType="separate"/>
+      </w:r>
+      <w:r>
+        <w:rPr>
+          <w:rStyle w:val="ae"/>
+        </w:rPr>
+        <w:t>https://github.com/CN-Fungi/Fungi</w:t>
+      </w:r>
+      <w:r>
+        <w:fldChar w:fldCharType="end"/>
+      </w:r>
     </w:p>
     <w:p>
       <w:pPr>
@@ -254,7 +267,7 @@
                     <pic:cNvPicPr/>
                   </pic:nvPicPr>
                   <pic:blipFill>
-                    <a:blip r:embed="rId7"/>
+                    <a:blip r:embed="rId6"/>
                     <a:stretch>
                       <a:fillRect/>
                     </a:stretch>
@@ -398,7 +411,7 @@
                     <pic:cNvPicPr/>
                   </pic:nvPicPr>
                   <pic:blipFill>
-                    <a:blip r:embed="rId8"/>
+                    <a:blip r:embed="rId7"/>
                     <a:stretch>
                       <a:fillRect/>
                     </a:stretch>
@@ -472,7 +485,7 @@
                     <pic:cNvPicPr/>
                   </pic:nvPicPr>
                   <pic:blipFill>
-                    <a:blip r:embed="rId9"/>
+                    <a:blip r:embed="rId8"/>
                     <a:stretch>
                       <a:fillRect/>
                     </a:stretch>
@@ -521,7 +534,7 @@
                     <pic:cNvPicPr/>
                   </pic:nvPicPr>
                   <pic:blipFill>
-                    <a:blip r:embed="rId10"/>
+                    <a:blip r:embed="rId9"/>
                     <a:stretch>
                       <a:fillRect/>
                     </a:stretch>
@@ -606,6 +619,54 @@
                 <pic:pic xmlns:pic="http://schemas.openxmlformats.org/drawingml/2006/picture">
                   <pic:nvPicPr>
                     <pic:cNvPr id="2046942151" name=""/>
+                    <pic:cNvPicPr/>
+                  </pic:nvPicPr>
+                  <pic:blipFill>
+                    <a:blip r:embed="rId10"/>
+                    <a:stretch>
+                      <a:fillRect/>
+                    </a:stretch>
+                  </pic:blipFill>
+                  <pic:spPr>
+                    <a:xfrm>
+                      <a:off x="0" y="0"/>
+                      <a:ext cx="5274310" cy="4937125"/>
+                    </a:xfrm>
+                    <a:prstGeom prst="rect">
+                      <a:avLst/>
+                    </a:prstGeom>
+                  </pic:spPr>
+                </pic:pic>
+              </a:graphicData>
+            </a:graphic>
+          </wp:inline>
+        </w:drawing>
+      </w:r>
+    </w:p>
+    <w:p>
+      <w:pPr>
+        <w:rPr>
+          <w:rFonts w:hint="eastAsia"/>
+        </w:rPr>
+      </w:pPr>
+      <w:r>
+        <w:rPr>
+          <w:noProof/>
+        </w:rPr>
+        <w:lastRenderedPageBreak/>
+        <w:drawing>
+          <wp:inline distT="0" distB="0" distL="0" distR="0" wp14:anchorId="471C43AE" wp14:editId="03826C2A">
+            <wp:extent cx="5274310" cy="4937125"/>
+            <wp:effectExtent l="0" t="0" r="2540" b="0"/>
+            <wp:docPr id="1419067235" name="图片 1"/>
+            <wp:cNvGraphicFramePr>
+              <a:graphicFrameLocks xmlns:a="http://schemas.openxmlformats.org/drawingml/2006/main" noChangeAspect="1"/>
+            </wp:cNvGraphicFramePr>
+            <a:graphic xmlns:a="http://schemas.openxmlformats.org/drawingml/2006/main">
+              <a:graphicData uri="http://schemas.openxmlformats.org/drawingml/2006/picture">
+                <pic:pic xmlns:pic="http://schemas.openxmlformats.org/drawingml/2006/picture">
+                  <pic:nvPicPr>
+                    <pic:cNvPr id="1419067235" name=""/>
                     <pic:cNvPicPr/>
                   </pic:nvPicPr>
                   <pic:blipFill>
@@ -636,54 +697,6 @@
           <w:rFonts w:hint="eastAsia"/>
         </w:rPr>
       </w:pPr>
-      <w:r>
-        <w:rPr>
-          <w:noProof/>
-        </w:rPr>
-        <w:lastRenderedPageBreak/>
-        <w:drawing>
-          <wp:inline distT="0" distB="0" distL="0" distR="0" wp14:anchorId="471C43AE" wp14:editId="03826C2A">
-            <wp:extent cx="5274310" cy="4937125"/>
-            <wp:effectExtent l="0" t="0" r="2540" b="0"/>
-            <wp:docPr id="1419067235" name="图片 1"/>
-            <wp:cNvGraphicFramePr>
-              <a:graphicFrameLocks xmlns:a="http://schemas.openxmlformats.org/drawingml/2006/main" noChangeAspect="1"/>
-            </wp:cNvGraphicFramePr>
-            <a:graphic xmlns:a="http://schemas.openxmlformats.org/drawingml/2006/main">
-              <a:graphicData uri="http://schemas.openxmlformats.org/drawingml/2006/picture">
-                <pic:pic xmlns:pic="http://schemas.openxmlformats.org/drawingml/2006/picture">
-                  <pic:nvPicPr>
-                    <pic:cNvPr id="1419067235" name=""/>
-                    <pic:cNvPicPr/>
-                  </pic:nvPicPr>
-                  <pic:blipFill>
-                    <a:blip r:embed="rId12"/>
-                    <a:stretch>
-                      <a:fillRect/>
-                    </a:stretch>
-                  </pic:blipFill>
-                  <pic:spPr>
-                    <a:xfrm>
-                      <a:off x="0" y="0"/>
-                      <a:ext cx="5274310" cy="4937125"/>
-                    </a:xfrm>
-                    <a:prstGeom prst="rect">
-                      <a:avLst/>
-                    </a:prstGeom>
-                  </pic:spPr>
-                </pic:pic>
-              </a:graphicData>
-            </a:graphic>
-          </wp:inline>
-        </w:drawing>
-      </w:r>
-    </w:p>
-    <w:p>
-      <w:pPr>
-        <w:rPr>
-          <w:rFonts w:hint="eastAsia"/>
-        </w:rPr>
-      </w:pPr>
     </w:p>
     <w:p>
       <w:pPr>
@@ -835,7 +848,7 @@
                     <pic:cNvPicPr/>
                   </pic:nvPicPr>
                   <pic:blipFill>
-                    <a:blip r:embed="rId13"/>
+                    <a:blip r:embed="rId12"/>
                     <a:stretch>
                       <a:fillRect/>
                     </a:stretch>
@@ -883,7 +896,7 @@
                     <pic:cNvPicPr/>
                   </pic:nvPicPr>
                   <pic:blipFill>
-                    <a:blip r:embed="rId14"/>
+                    <a:blip r:embed="rId13"/>
                     <a:stretch>
                       <a:fillRect/>
                     </a:stretch>
@@ -975,7 +988,7 @@
                     <pic:cNvPicPr/>
                   </pic:nvPicPr>
                   <pic:blipFill>
-                    <a:blip r:embed="rId15"/>
+                    <a:blip r:embed="rId14"/>
                     <a:stretch>
                       <a:fillRect/>
                     </a:stretch>
@@ -1051,7 +1064,7 @@
                     </pic:cNvPicPr>
                   </pic:nvPicPr>
                   <pic:blipFill>
-                    <a:blip r:embed="rId16" cstate="print">
+                    <a:blip r:embed="rId15" cstate="print">
                       <a:extLst>
                         <a:ext uri="{28A0092B-C50C-407E-A947-70E740481C1C}">
                           <a14:useLocalDpi xmlns:a14="http://schemas.microsoft.com/office/drawing/2010/main" val="0"/>
@@ -1203,7 +1216,7 @@
                     <pic:cNvPicPr/>
                   </pic:nvPicPr>
                   <pic:blipFill>
-                    <a:blip r:embed="rId17"/>
+                    <a:blip r:embed="rId16"/>
                     <a:stretch>
                       <a:fillRect/>
                     </a:stretch>
@@ -1253,7 +1266,14 @@
         <w:rPr>
           <w:rFonts w:hint="eastAsia"/>
         </w:rPr>
-        <w:t>如果发起后网络环境发生变化</w:t>
+        <w:t>如果发起后网络环境发生</w:t>
+      </w:r>
+      <w:proofErr w:type="gramStart"/>
+      <w:r>
+        <w:rPr>
+          <w:rFonts w:hint="eastAsia"/>
+        </w:rPr>
+        <w:t>变化</w:t>
       </w:r>
       <w:r>
         <w:rPr>
@@ -1261,11 +1281,19 @@
         </w:rPr>
         <w:t>,</w:t>
       </w:r>
-      <w:r>
-        <w:rPr>
-          <w:rFonts w:hint="eastAsia"/>
-        </w:rPr>
-        <w:t>可以刷新IP再试</w:t>
+      <w:proofErr w:type="gramEnd"/>
+      <w:r>
+        <w:rPr>
+          <w:rFonts w:hint="eastAsia"/>
+        </w:rPr>
+        <w:t>可以刷新IP再</w:t>
+      </w:r>
+      <w:proofErr w:type="gramStart"/>
+      <w:r>
+        <w:rPr>
+          <w:rFonts w:hint="eastAsia"/>
+        </w:rPr>
+        <w:t>试</w:t>
       </w:r>
       <w:r>
         <w:rPr>
@@ -1273,6 +1301,7 @@
         </w:rPr>
         <w:t>)</w:t>
       </w:r>
+      <w:proofErr w:type="gramEnd"/>
       <w:r>
         <w:rPr>
           <w:rFonts w:hint="eastAsia"/>
@@ -1306,7 +1335,7 @@
                     <pic:cNvPicPr/>
                   </pic:nvPicPr>
                   <pic:blipFill>
-                    <a:blip r:embed="rId18"/>
+                    <a:blip r:embed="rId17"/>
                     <a:stretch>
                       <a:fillRect/>
                     </a:stretch>
@@ -1338,7 +1367,21 @@
           <w:rFonts w:hint="eastAsia"/>
         </w:rPr>
         <w:lastRenderedPageBreak/>
-        <w:t>发起或加入房间后，点击下方“打开WebUI”即可进入网页：</w:t>
+        <w:t>发起或加入房间后，点击下方“打开</w:t>
+      </w:r>
+      <w:proofErr w:type="spellStart"/>
+      <w:r>
+        <w:rPr>
+          <w:rFonts w:hint="eastAsia"/>
+        </w:rPr>
+        <w:t>WebUI</w:t>
+      </w:r>
+      <w:proofErr w:type="spellEnd"/>
+      <w:r>
+        <w:rPr>
+          <w:rFonts w:hint="eastAsia"/>
+        </w:rPr>
+        <w:t>”即可进入网页：</w:t>
       </w:r>
     </w:p>
     <w:p>
@@ -1352,7 +1395,7 @@
           <w:noProof/>
         </w:rPr>
         <w:drawing>
-          <wp:inline distT="0" distB="0" distL="0" distR="0" wp14:anchorId="049B5030" wp14:editId="576A3C90">
+          <wp:inline distT="0" distB="0" distL="0" distR="0" wp14:anchorId="049B5030" wp14:editId="5F0B2EDE">
             <wp:extent cx="5274310" cy="3378835"/>
             <wp:effectExtent l="0" t="0" r="2540" b="0"/>
             <wp:docPr id="554474087" name="图片 3"/>
@@ -1369,7 +1412,7 @@
                     </pic:cNvPicPr>
                   </pic:nvPicPr>
                   <pic:blipFill>
-                    <a:blip r:embed="rId19" cstate="print">
+                    <a:blip r:embed="rId18" cstate="print">
                       <a:extLst>
                         <a:ext uri="{28A0092B-C50C-407E-A947-70E740481C1C}">
                           <a14:useLocalDpi xmlns:a14="http://schemas.microsoft.com/office/drawing/2010/main" val="0"/>
@@ -1465,7 +1508,7 @@
                     <pic:cNvPicPr/>
                   </pic:nvPicPr>
                   <pic:blipFill>
-                    <a:blip r:embed="rId20"/>
+                    <a:blip r:embed="rId19"/>
                     <a:stretch>
                       <a:fillRect/>
                     </a:stretch>
@@ -1545,14 +1588,27 @@
         </w:rPr>
         <w:t>创建API：</w:t>
       </w:r>
-      <w:hyperlink r:id="rId21" w:history="1">
-        <w:r>
-          <w:rPr>
-            <w:rStyle w:val="ae"/>
-          </w:rPr>
-          <w:t>https://platform.deepseek.com/api_keys</w:t>
-        </w:r>
-      </w:hyperlink>
+      <w:r>
+        <w:fldChar w:fldCharType="begin"/>
+      </w:r>
+      <w:r>
+        <w:instrText>HYPERLINK "https://platform.deepseek.com/api_keys"</w:instrText>
+      </w:r>
+      <w:r>
+        <w:rPr>
+          <w:rFonts w:hint="eastAsia"/>
+        </w:rPr>
+        <w:fldChar w:fldCharType="separate"/>
+      </w:r>
+      <w:r>
+        <w:rPr>
+          <w:rStyle w:val="ae"/>
+        </w:rPr>
+        <w:t>https://platform.deepseek.com/api_keys</w:t>
+      </w:r>
+      <w:r>
+        <w:fldChar w:fldCharType="end"/>
+      </w:r>
     </w:p>
     <w:p>
       <w:pPr>
@@ -1580,7 +1636,7 @@
                     <pic:cNvPicPr/>
                   </pic:nvPicPr>
                   <pic:blipFill>
-                    <a:blip r:embed="rId22"/>
+                    <a:blip r:embed="rId20"/>
                     <a:stretch>
                       <a:fillRect/>
                     </a:stretch>
@@ -1651,7 +1707,7 @@
                     <pic:cNvPicPr/>
                   </pic:nvPicPr>
                   <pic:blipFill>
-                    <a:blip r:embed="rId23"/>
+                    <a:blip r:embed="rId21"/>
                     <a:stretch>
                       <a:fillRect/>
                     </a:stretch>
@@ -1778,7 +1834,7 @@
                     <pic:cNvPicPr/>
                   </pic:nvPicPr>
                   <pic:blipFill>
-                    <a:blip r:embed="rId24"/>
+                    <a:blip r:embed="rId22"/>
                     <a:stretch>
                       <a:fillRect/>
                     </a:stretch>
@@ -1855,7 +1911,7 @@
                     <pic:cNvPicPr/>
                   </pic:nvPicPr>
                   <pic:blipFill>
-                    <a:blip r:embed="rId25"/>
+                    <a:blip r:embed="rId23"/>
                     <a:stretch>
                       <a:fillRect/>
                     </a:stretch>
@@ -1918,12 +1974,20 @@
           <w:bCs/>
         </w:rPr>
       </w:pPr>
+      <w:proofErr w:type="spellStart"/>
       <w:r>
         <w:rPr>
           <w:rFonts w:hint="eastAsia"/>
         </w:rPr>
         <w:lastRenderedPageBreak/>
-        <w:t>Deepseek接口地址（Endpoint）</w:t>
+        <w:t>Deepseek</w:t>
+      </w:r>
+      <w:proofErr w:type="spellEnd"/>
+      <w:r>
+        <w:rPr>
+          <w:rFonts w:hint="eastAsia"/>
+        </w:rPr>
+        <w:t>接口地址（Endpoint）</w:t>
       </w:r>
       <w:r>
         <w:rPr>
@@ -2128,7 +2192,7 @@
                     <pic:cNvPicPr/>
                   </pic:nvPicPr>
                   <pic:blipFill>
-                    <a:blip r:embed="rId26"/>
+                    <a:blip r:embed="rId24"/>
                     <a:stretch>
                       <a:fillRect/>
                     </a:stretch>
@@ -2457,11 +2521,97 @@
           <w:rFonts w:hint="eastAsia"/>
         </w:rPr>
       </w:pPr>
-      <w:r>
-        <w:rPr>
-          <w:rFonts w:hint="eastAsia"/>
-        </w:rPr>
-        <w:t>视频理解：这是一个实验性功能，配置比较复杂（不过我的电脑已经配置好了，让我来测试吧</w:t>
+      <w:proofErr w:type="spellStart"/>
+      <w:r>
+        <w:rPr>
+          <w:rFonts w:hint="eastAsia"/>
+        </w:rPr>
+        <w:t>Ghostworld</w:t>
+      </w:r>
+      <w:proofErr w:type="spellEnd"/>
+      <w:r>
+        <w:rPr>
+          <w:rFonts w:hint="eastAsia"/>
+        </w:rPr>
+        <w:t>角色控制：这是一个拓展性功能，</w:t>
+      </w:r>
+      <w:proofErr w:type="spellStart"/>
+      <w:r>
+        <w:rPr>
+          <w:rFonts w:hint="eastAsia"/>
+        </w:rPr>
+        <w:t>Ghostworld</w:t>
+      </w:r>
+      <w:proofErr w:type="spellEnd"/>
+      <w:r>
+        <w:rPr>
+          <w:rFonts w:hint="eastAsia"/>
+        </w:rPr>
+        <w:t>原来是我做的另一个项目。有了</w:t>
+      </w:r>
+      <w:proofErr w:type="spellStart"/>
+      <w:r>
+        <w:rPr>
+          <w:rFonts w:hint="eastAsia"/>
+        </w:rPr>
+        <w:t>Ghostworld</w:t>
+      </w:r>
+      <w:proofErr w:type="spellEnd"/>
+      <w:r>
+        <w:rPr>
+          <w:rFonts w:hint="eastAsia"/>
+        </w:rPr>
+        <w:t>，Agent可以模拟</w:t>
+      </w:r>
+      <w:r>
+        <w:rPr>
+          <w:rFonts w:hint="eastAsia"/>
+          <w:b/>
+          <w:bCs/>
+        </w:rPr>
+        <w:t>在真实世界行走、对话、建造甚至一起合影。</w:t>
+      </w:r>
+    </w:p>
+    <w:p>
+      <w:pPr>
+        <w:pStyle w:val="a9"/>
+        <w:numPr>
+          <w:ilvl w:val="0"/>
+          <w:numId w:val="5"/>
+        </w:numPr>
+        <w:rPr>
+          <w:rFonts w:hint="eastAsia"/>
+        </w:rPr>
+      </w:pPr>
+      <w:r>
+        <w:rPr>
+          <w:rFonts w:hint="eastAsia"/>
+        </w:rPr>
+        <w:t>视频理解：这</w:t>
+      </w:r>
+      <w:r>
+        <w:rPr>
+          <w:rFonts w:hint="eastAsia"/>
+        </w:rPr>
+        <w:t>也</w:t>
+      </w:r>
+      <w:r>
+        <w:rPr>
+          <w:rFonts w:hint="eastAsia"/>
+        </w:rPr>
+        <w:t>是一个</w:t>
+      </w:r>
+      <w:r>
+        <w:rPr>
+          <w:rFonts w:hint="eastAsia"/>
+        </w:rPr>
+        <w:t>拓展</w:t>
+      </w:r>
+      <w:r>
+        <w:rPr>
+          <w:rFonts w:hint="eastAsia"/>
+        </w:rPr>
+        <w:t>性功能，配置比较复杂（不过我的电脑已经配置好了，让我来测试吧</w:t>
       </w:r>
       <w:r>
         <w:rPr>
@@ -2694,7 +2844,6 @@
           <w:sz w:val="24"/>
           <w:szCs w:val="28"/>
         </w:rPr>
-        <w:lastRenderedPageBreak/>
         <w:t>测试用例</w:t>
       </w:r>
       <w:r>
@@ -3140,7 +3289,6 @@
         <w:rPr>
           <w:rFonts w:hint="eastAsia"/>
         </w:rPr>
-        <w:lastRenderedPageBreak/>
         <w:t>桌面控制</w:t>
       </w:r>
     </w:p>
@@ -3220,9 +3368,13 @@
         </w:rPr>
         <w:t>测试二：让Agent新建文本文档，并在里面输入一段文字。</w:t>
       </w:r>
-      <w:r>
-        <w:br/>
-      </w:r>
+    </w:p>
+    <w:p>
+      <w:pPr>
+        <w:rPr>
+          <w:rFonts w:hint="eastAsia"/>
+        </w:rPr>
+      </w:pPr>
     </w:p>
     <w:p>
       <w:pPr>
@@ -3235,239 +3387,214 @@
           <w:rFonts w:hint="eastAsia"/>
         </w:rPr>
       </w:pPr>
-      <w:r>
-        <w:rPr>
-          <w:rFonts w:hint="eastAsia"/>
-        </w:rPr>
-        <w:t>消息转告流</w:t>
-      </w:r>
-    </w:p>
-    <w:p>
-      <w:pPr>
-        <w:rPr>
-          <w:rFonts w:hint="eastAsia"/>
-        </w:rPr>
-      </w:pPr>
-      <w:r>
-        <w:rPr>
-          <w:rFonts w:hint="eastAsia"/>
-        </w:rPr>
-        <w:t>一方开好房间，另一方加入房间。试着让其中一方</w:t>
-      </w:r>
-      <w:r>
-        <w:rPr>
-          <w:rFonts w:hint="eastAsia"/>
-          <w:b/>
-          <w:bCs/>
-        </w:rPr>
-        <w:t>设置好长期记忆和待办事项</w:t>
-      </w:r>
-      <w:r>
-        <w:rPr>
-          <w:rFonts w:hint="eastAsia"/>
-        </w:rPr>
-        <w:t>，另一方询问相关信息 ，看长期记忆和待办事项是否起效。</w:t>
-      </w:r>
-    </w:p>
-    <w:p>
-      <w:pPr>
-        <w:rPr>
-          <w:rFonts w:hint="eastAsia"/>
-        </w:rPr>
-      </w:pPr>
-    </w:p>
-    <w:p>
-      <w:pPr>
-        <w:rPr>
-          <w:rFonts w:hint="eastAsia"/>
-        </w:rPr>
-      </w:pPr>
-      <w:r>
-        <w:rPr>
-          <w:rFonts w:hint="eastAsia"/>
-        </w:rPr>
-        <w:t>比如说：</w:t>
-      </w:r>
-    </w:p>
-    <w:p>
-      <w:pPr>
-        <w:rPr>
-          <w:rFonts w:hint="eastAsia"/>
-        </w:rPr>
-      </w:pPr>
-      <w:r>
-        <w:rPr>
-          <w:rFonts w:hint="eastAsia"/>
-        </w:rPr>
-        <w:t>长期记忆为“我叫Blinvo，在天津理工大学上大三，今年19岁”</w:t>
-      </w:r>
-    </w:p>
-    <w:p>
-      <w:pPr>
-        <w:rPr>
-          <w:rFonts w:hint="eastAsia"/>
-        </w:rPr>
-      </w:pPr>
-      <w:r>
-        <w:rPr>
-          <w:rFonts w:hint="eastAsia"/>
-        </w:rPr>
-        <w:t>待办事项为“下周二去B309听魏老师上计算机网络课”。</w:t>
-      </w:r>
-    </w:p>
-    <w:p>
-      <w:pPr>
-        <w:rPr>
-          <w:rFonts w:hint="eastAsia"/>
-        </w:rPr>
-      </w:pPr>
-    </w:p>
-    <w:p>
-      <w:pPr>
-        <w:rPr>
-          <w:rFonts w:hint="eastAsia"/>
-        </w:rPr>
-      </w:pPr>
-      <w:r>
-        <w:rPr>
-          <w:rFonts w:hint="eastAsia"/>
-        </w:rPr>
-        <w:t>另一方询问：</w:t>
-      </w:r>
-    </w:p>
-    <w:p>
-      <w:pPr>
-        <w:rPr>
-          <w:rFonts w:hint="eastAsia"/>
-        </w:rPr>
-      </w:pPr>
-      <w:r>
-        <w:rPr>
-          <w:rFonts w:hint="eastAsia"/>
-        </w:rPr>
-        <w:t>“你好，请问你叫什么名字？”</w:t>
-      </w:r>
-    </w:p>
-    <w:p>
-      <w:pPr>
-        <w:rPr>
-          <w:rFonts w:hint="eastAsia"/>
-        </w:rPr>
-      </w:pPr>
-      <w:r>
-        <w:rPr>
-          <w:rFonts w:hint="eastAsia"/>
-        </w:rPr>
-        <w:t>“下周二有空一起出去玩吗？”</w:t>
-      </w:r>
-    </w:p>
-    <w:p>
-      <w:pPr>
-        <w:rPr>
-          <w:rFonts w:hint="eastAsia"/>
-        </w:rPr>
-      </w:pPr>
-      <w:r>
-        <w:rPr>
-          <w:rFonts w:hint="eastAsia"/>
-        </w:rPr>
-        <w:t>“那周三一起出去怎么样？”</w:t>
-      </w:r>
-    </w:p>
-    <w:p>
-      <w:pPr>
-        <w:rPr>
-          <w:rFonts w:hint="eastAsia"/>
-        </w:rPr>
-      </w:pPr>
-    </w:p>
-    <w:p>
-      <w:pPr>
-        <w:rPr>
-          <w:rFonts w:hint="eastAsia"/>
-        </w:rPr>
-      </w:pPr>
-      <w:r>
-        <w:rPr>
-          <w:rFonts w:hint="eastAsia"/>
-        </w:rPr>
-        <w:t>理想的状况是，信使会自动回复，</w:t>
-      </w:r>
-      <w:r>
-        <w:rPr>
-          <w:rFonts w:hint="eastAsia"/>
-          <w:b/>
-          <w:bCs/>
-        </w:rPr>
-        <w:t>告诉来信人主人的名字，明天没空，后天可以约</w:t>
-      </w:r>
-      <w:r>
-        <w:rPr>
-          <w:rFonts w:hint="eastAsia"/>
-        </w:rPr>
-        <w:t>。</w:t>
-      </w:r>
-    </w:p>
-    <w:p>
-      <w:pPr>
-        <w:rPr>
-          <w:rFonts w:hint="eastAsia"/>
-        </w:rPr>
-      </w:pPr>
-      <w:r>
-        <w:rPr>
-          <w:rFonts w:hint="eastAsia"/>
-        </w:rPr>
-        <w:t>之后信使会主动确定周三</w:t>
-      </w:r>
-      <w:r>
-        <w:rPr>
-          <w:rFonts w:hint="eastAsia"/>
-          <w:b/>
-          <w:bCs/>
-        </w:rPr>
-        <w:t>具体什么时候，去哪儿玩，以及玩什么</w:t>
-      </w:r>
-      <w:r>
-        <w:rPr>
-          <w:rFonts w:hint="eastAsia"/>
-        </w:rPr>
-        <w:t>。</w:t>
-      </w:r>
-    </w:p>
-    <w:p>
-      <w:pPr>
-        <w:rPr>
-          <w:rFonts w:hint="eastAsia"/>
-        </w:rPr>
-      </w:pPr>
-      <w:r>
-        <w:rPr>
-          <w:rFonts w:hint="eastAsia"/>
-        </w:rPr>
-        <w:t>最后信使会将周三的日程</w:t>
-      </w:r>
-      <w:r>
-        <w:rPr>
-          <w:rFonts w:hint="eastAsia"/>
-          <w:b/>
-          <w:bCs/>
-        </w:rPr>
-        <w:t>记入待办事项</w:t>
-      </w:r>
-      <w:r>
-        <w:rPr>
-          <w:rFonts w:hint="eastAsia"/>
-        </w:rPr>
-        <w:t>中，可以在日历中查看。</w:t>
-      </w:r>
-    </w:p>
-    <w:p>
-      <w:pPr>
-        <w:rPr>
-          <w:rFonts w:hint="eastAsia"/>
-        </w:rPr>
-      </w:pPr>
+      <w:proofErr w:type="spellStart"/>
+      <w:r>
+        <w:rPr>
+          <w:rFonts w:hint="eastAsia"/>
+        </w:rPr>
+        <w:t>Ghostworld</w:t>
+      </w:r>
+      <w:proofErr w:type="spellEnd"/>
+      <w:r>
+        <w:rPr>
+          <w:rFonts w:hint="eastAsia"/>
+        </w:rPr>
+        <w:t>角色控制</w:t>
+      </w:r>
+    </w:p>
+    <w:p>
+      <w:r>
+        <w:rPr>
+          <w:rFonts w:hint="eastAsia"/>
+        </w:rPr>
+        <w:t>仓库</w:t>
+      </w:r>
+      <w:r>
+        <w:rPr>
+          <w:rFonts w:hint="eastAsia"/>
+        </w:rPr>
+        <w:t>地址：</w:t>
+      </w:r>
+      <w:hyperlink r:id="rId25" w:history="1">
+        <w:r>
+          <w:rPr>
+            <w:rStyle w:val="ae"/>
+          </w:rPr>
+          <w:t>https://github.com/Offblink/GhostWorld</w:t>
+        </w:r>
+      </w:hyperlink>
+    </w:p>
+    <w:p>
+      <w:r>
+        <w:rPr>
+          <w:rFonts w:hint="eastAsia"/>
+        </w:rPr>
+        <w:t>下载最新release，将目录路径填入启动器：</w:t>
+      </w:r>
+    </w:p>
+    <w:p>
+      <w:pPr>
+        <w:rPr>
+          <w:rFonts w:hint="eastAsia"/>
+        </w:rPr>
+      </w:pPr>
+      <w:r>
+        <w:drawing>
+          <wp:inline distT="0" distB="0" distL="0" distR="0" wp14:anchorId="0AB01E71" wp14:editId="3626B764">
+            <wp:extent cx="5274310" cy="3368040"/>
+            <wp:effectExtent l="0" t="0" r="2540" b="3810"/>
+            <wp:docPr id="2074226713" name="图片 1"/>
+            <wp:cNvGraphicFramePr>
+              <a:graphicFrameLocks xmlns:a="http://schemas.openxmlformats.org/drawingml/2006/main" noChangeAspect="1"/>
+            </wp:cNvGraphicFramePr>
+            <a:graphic xmlns:a="http://schemas.openxmlformats.org/drawingml/2006/main">
+              <a:graphicData uri="http://schemas.openxmlformats.org/drawingml/2006/picture">
+                <pic:pic xmlns:pic="http://schemas.openxmlformats.org/drawingml/2006/picture">
+                  <pic:nvPicPr>
+                    <pic:cNvPr id="2074226713" name=""/>
+                    <pic:cNvPicPr/>
+                  </pic:nvPicPr>
+                  <pic:blipFill>
+                    <a:blip r:embed="rId26"/>
+                    <a:stretch>
+                      <a:fillRect/>
+                    </a:stretch>
+                  </pic:blipFill>
+                  <pic:spPr>
+                    <a:xfrm>
+                      <a:off x="0" y="0"/>
+                      <a:ext cx="5274310" cy="3368040"/>
+                    </a:xfrm>
+                    <a:prstGeom prst="rect">
+                      <a:avLst/>
+                    </a:prstGeom>
+                  </pic:spPr>
+                </pic:pic>
+              </a:graphicData>
+            </a:graphic>
+          </wp:inline>
+        </w:drawing>
+      </w:r>
+    </w:p>
+    <w:p>
+      <w:r>
+        <w:rPr>
+          <w:rFonts w:hint="eastAsia"/>
+        </w:rPr>
+        <w:t>同时打开房间和</w:t>
+      </w:r>
+      <w:proofErr w:type="spellStart"/>
+      <w:r>
+        <w:rPr>
+          <w:rFonts w:hint="eastAsia"/>
+        </w:rPr>
+        <w:t>Ghostworld</w:t>
+      </w:r>
+      <w:proofErr w:type="spellEnd"/>
+      <w:r>
+        <w:rPr>
+          <w:rFonts w:hint="eastAsia"/>
+        </w:rPr>
+        <w:t>，在</w:t>
+      </w:r>
+      <w:proofErr w:type="spellStart"/>
+      <w:r>
+        <w:rPr>
+          <w:rFonts w:hint="eastAsia"/>
+        </w:rPr>
+        <w:t>Ghostworld</w:t>
+      </w:r>
+      <w:proofErr w:type="spellEnd"/>
+      <w:r>
+        <w:rPr>
+          <w:rFonts w:hint="eastAsia"/>
+        </w:rPr>
+        <w:t>中切换为英文输入法，然后回车输入信息，看Fungi会不会回应：</w:t>
+      </w:r>
+    </w:p>
+    <w:p>
+      <w:r>
+        <w:lastRenderedPageBreak/>
+        <w:drawing>
+          <wp:inline distT="0" distB="0" distL="0" distR="0" wp14:anchorId="682ACD4F" wp14:editId="38464FD8">
+            <wp:extent cx="3848100" cy="4602431"/>
+            <wp:effectExtent l="0" t="0" r="0" b="8255"/>
+            <wp:docPr id="1234558026" name="图片 1"/>
+            <wp:cNvGraphicFramePr>
+              <a:graphicFrameLocks xmlns:a="http://schemas.openxmlformats.org/drawingml/2006/main" noChangeAspect="1"/>
+            </wp:cNvGraphicFramePr>
+            <a:graphic xmlns:a="http://schemas.openxmlformats.org/drawingml/2006/main">
+              <a:graphicData uri="http://schemas.openxmlformats.org/drawingml/2006/picture">
+                <pic:pic xmlns:pic="http://schemas.openxmlformats.org/drawingml/2006/picture">
+                  <pic:nvPicPr>
+                    <pic:cNvPr id="1234558026" name=""/>
+                    <pic:cNvPicPr/>
+                  </pic:nvPicPr>
+                  <pic:blipFill>
+                    <a:blip r:embed="rId27"/>
+                    <a:stretch>
+                      <a:fillRect/>
+                    </a:stretch>
+                  </pic:blipFill>
+                  <pic:spPr>
+                    <a:xfrm>
+                      <a:off x="0" y="0"/>
+                      <a:ext cx="3864647" cy="4622222"/>
+                    </a:xfrm>
+                    <a:prstGeom prst="rect">
+                      <a:avLst/>
+                    </a:prstGeom>
+                  </pic:spPr>
+                </pic:pic>
+              </a:graphicData>
+            </a:graphic>
+          </wp:inline>
+        </w:drawing>
+      </w:r>
+    </w:p>
+    <w:p>
+      <w:pPr>
+        <w:rPr>
+          <w:rFonts w:hint="eastAsia"/>
+        </w:rPr>
+      </w:pPr>
+      <w:r>
+        <w:drawing>
+          <wp:inline distT="0" distB="0" distL="0" distR="0" wp14:anchorId="55101DFE" wp14:editId="0B1D3B1E">
+            <wp:extent cx="5054600" cy="3940348"/>
+            <wp:effectExtent l="0" t="0" r="0" b="3175"/>
+            <wp:docPr id="775411061" name="图片 1"/>
+            <wp:cNvGraphicFramePr>
+              <a:graphicFrameLocks xmlns:a="http://schemas.openxmlformats.org/drawingml/2006/main" noChangeAspect="1"/>
+            </wp:cNvGraphicFramePr>
+            <a:graphic xmlns:a="http://schemas.openxmlformats.org/drawingml/2006/main">
+              <a:graphicData uri="http://schemas.openxmlformats.org/drawingml/2006/picture">
+                <pic:pic xmlns:pic="http://schemas.openxmlformats.org/drawingml/2006/picture">
+                  <pic:nvPicPr>
+                    <pic:cNvPr id="775411061" name=""/>
+                    <pic:cNvPicPr/>
+                  </pic:nvPicPr>
+                  <pic:blipFill>
+                    <a:blip r:embed="rId28"/>
+                    <a:stretch>
+                      <a:fillRect/>
+                    </a:stretch>
+                  </pic:blipFill>
+                  <pic:spPr>
+                    <a:xfrm>
+                      <a:off x="0" y="0"/>
+                      <a:ext cx="5060986" cy="3945326"/>
+                    </a:xfrm>
+                    <a:prstGeom prst="rect">
+                      <a:avLst/>
+                    </a:prstGeom>
+                  </pic:spPr>
+                </pic:pic>
+              </a:graphicData>
+            </a:graphic>
+          </wp:inline>
+        </w:drawing>
+      </w:r>
     </w:p>
     <w:p>
       <w:pPr>
@@ -3484,6 +3611,266 @@
         <w:rPr>
           <w:rFonts w:hint="eastAsia"/>
         </w:rPr>
+        <w:lastRenderedPageBreak/>
+        <w:t>消息转告流</w:t>
+      </w:r>
+    </w:p>
+    <w:p>
+      <w:pPr>
+        <w:rPr>
+          <w:rFonts w:hint="eastAsia"/>
+        </w:rPr>
+      </w:pPr>
+      <w:r>
+        <w:rPr>
+          <w:rFonts w:hint="eastAsia"/>
+        </w:rPr>
+        <w:t>一方开好房间，另一方加入房间。试着让其中一方</w:t>
+      </w:r>
+      <w:r>
+        <w:rPr>
+          <w:rFonts w:hint="eastAsia"/>
+          <w:b/>
+          <w:bCs/>
+        </w:rPr>
+        <w:t>设置好长期记忆和待办事项</w:t>
+      </w:r>
+      <w:r>
+        <w:rPr>
+          <w:rFonts w:hint="eastAsia"/>
+        </w:rPr>
+        <w:t>，另一方询问相关信息 ，看长期记忆和待办事项是否起效。</w:t>
+      </w:r>
+    </w:p>
+    <w:p>
+      <w:pPr>
+        <w:rPr>
+          <w:rFonts w:hint="eastAsia"/>
+        </w:rPr>
+      </w:pPr>
+    </w:p>
+    <w:p>
+      <w:pPr>
+        <w:rPr>
+          <w:rFonts w:hint="eastAsia"/>
+        </w:rPr>
+      </w:pPr>
+      <w:r>
+        <w:rPr>
+          <w:rFonts w:hint="eastAsia"/>
+        </w:rPr>
+        <w:t>比如说：</w:t>
+      </w:r>
+    </w:p>
+    <w:p>
+      <w:pPr>
+        <w:rPr>
+          <w:rFonts w:hint="eastAsia"/>
+        </w:rPr>
+      </w:pPr>
+      <w:r>
+        <w:rPr>
+          <w:rFonts w:hint="eastAsia"/>
+        </w:rPr>
+        <w:t>长期记忆为“我叫</w:t>
+      </w:r>
+      <w:proofErr w:type="spellStart"/>
+      <w:r>
+        <w:rPr>
+          <w:rFonts w:hint="eastAsia"/>
+        </w:rPr>
+        <w:t>Blinvo</w:t>
+      </w:r>
+      <w:proofErr w:type="spellEnd"/>
+      <w:r>
+        <w:rPr>
+          <w:rFonts w:hint="eastAsia"/>
+        </w:rPr>
+        <w:t>，在天津理工大学上大三，今年19岁”</w:t>
+      </w:r>
+    </w:p>
+    <w:p>
+      <w:pPr>
+        <w:rPr>
+          <w:rFonts w:hint="eastAsia"/>
+        </w:rPr>
+      </w:pPr>
+      <w:r>
+        <w:rPr>
+          <w:rFonts w:hint="eastAsia"/>
+        </w:rPr>
+        <w:t>待办事项为“下周二去B309听魏老师上计算机网络课”。</w:t>
+      </w:r>
+    </w:p>
+    <w:p>
+      <w:pPr>
+        <w:rPr>
+          <w:rFonts w:hint="eastAsia"/>
+        </w:rPr>
+      </w:pPr>
+    </w:p>
+    <w:p>
+      <w:pPr>
+        <w:rPr>
+          <w:rFonts w:hint="eastAsia"/>
+        </w:rPr>
+      </w:pPr>
+      <w:r>
+        <w:rPr>
+          <w:rFonts w:hint="eastAsia"/>
+        </w:rPr>
+        <w:t>另一方询问：</w:t>
+      </w:r>
+    </w:p>
+    <w:p>
+      <w:pPr>
+        <w:rPr>
+          <w:rFonts w:hint="eastAsia"/>
+        </w:rPr>
+      </w:pPr>
+      <w:r>
+        <w:rPr>
+          <w:rFonts w:hint="eastAsia"/>
+        </w:rPr>
+        <w:t>“你好，请问你叫什么名字？”</w:t>
+      </w:r>
+    </w:p>
+    <w:p>
+      <w:pPr>
+        <w:rPr>
+          <w:rFonts w:hint="eastAsia"/>
+        </w:rPr>
+      </w:pPr>
+      <w:r>
+        <w:rPr>
+          <w:rFonts w:hint="eastAsia"/>
+        </w:rPr>
+        <w:t>“下周二有空一起出去玩吗？”</w:t>
+      </w:r>
+    </w:p>
+    <w:p>
+      <w:pPr>
+        <w:rPr>
+          <w:rFonts w:hint="eastAsia"/>
+        </w:rPr>
+      </w:pPr>
+      <w:r>
+        <w:rPr>
+          <w:rFonts w:hint="eastAsia"/>
+        </w:rPr>
+        <w:t>“那周三一起出去怎么样？”</w:t>
+      </w:r>
+    </w:p>
+    <w:p>
+      <w:pPr>
+        <w:rPr>
+          <w:rFonts w:hint="eastAsia"/>
+        </w:rPr>
+      </w:pPr>
+    </w:p>
+    <w:p>
+      <w:pPr>
+        <w:rPr>
+          <w:rFonts w:hint="eastAsia"/>
+        </w:rPr>
+      </w:pPr>
+      <w:r>
+        <w:rPr>
+          <w:rFonts w:hint="eastAsia"/>
+        </w:rPr>
+        <w:t>理想的状况是，信使会自动回复，</w:t>
+      </w:r>
+      <w:r>
+        <w:rPr>
+          <w:rFonts w:hint="eastAsia"/>
+          <w:b/>
+          <w:bCs/>
+        </w:rPr>
+        <w:t>告诉来信人主人的名字，明天没空，后天可以约</w:t>
+      </w:r>
+      <w:r>
+        <w:rPr>
+          <w:rFonts w:hint="eastAsia"/>
+        </w:rPr>
+        <w:t>。</w:t>
+      </w:r>
+    </w:p>
+    <w:p>
+      <w:pPr>
+        <w:rPr>
+          <w:rFonts w:hint="eastAsia"/>
+        </w:rPr>
+      </w:pPr>
+      <w:r>
+        <w:rPr>
+          <w:rFonts w:hint="eastAsia"/>
+        </w:rPr>
+        <w:t>之后信使会主动确定周三</w:t>
+      </w:r>
+      <w:r>
+        <w:rPr>
+          <w:rFonts w:hint="eastAsia"/>
+          <w:b/>
+          <w:bCs/>
+        </w:rPr>
+        <w:t>具体什么时候，去哪儿玩，以及玩什么</w:t>
+      </w:r>
+      <w:r>
+        <w:rPr>
+          <w:rFonts w:hint="eastAsia"/>
+        </w:rPr>
+        <w:t>。</w:t>
+      </w:r>
+    </w:p>
+    <w:p>
+      <w:pPr>
+        <w:rPr>
+          <w:rFonts w:hint="eastAsia"/>
+        </w:rPr>
+      </w:pPr>
+      <w:r>
+        <w:rPr>
+          <w:rFonts w:hint="eastAsia"/>
+        </w:rPr>
+        <w:t>最后信使会将周三的日程</w:t>
+      </w:r>
+      <w:r>
+        <w:rPr>
+          <w:rFonts w:hint="eastAsia"/>
+          <w:b/>
+          <w:bCs/>
+        </w:rPr>
+        <w:t>记入待办事项</w:t>
+      </w:r>
+      <w:r>
+        <w:rPr>
+          <w:rFonts w:hint="eastAsia"/>
+        </w:rPr>
+        <w:t>中，可以在日历中查看。</w:t>
+      </w:r>
+    </w:p>
+    <w:p>
+      <w:pPr>
+        <w:rPr>
+          <w:rFonts w:hint="eastAsia"/>
+        </w:rPr>
+      </w:pPr>
+    </w:p>
+    <w:p>
+      <w:pPr>
+        <w:pStyle w:val="a9"/>
+        <w:numPr>
+          <w:ilvl w:val="0"/>
+          <w:numId w:val="6"/>
+        </w:numPr>
+        <w:rPr>
+          <w:rFonts w:hint="eastAsia"/>
+        </w:rPr>
+      </w:pPr>
+      <w:r>
+        <w:rPr>
+          <w:rFonts w:hint="eastAsia"/>
+        </w:rPr>
         <w:t>文件传输流</w:t>
       </w:r>
     </w:p>
@@ -3550,7 +3937,7 @@
         </w:rPr>
         <w:lastRenderedPageBreak/>
         <w:drawing>
-          <wp:inline distT="0" distB="0" distL="0" distR="0" wp14:anchorId="42F1C4D7" wp14:editId="0879DFF2">
+          <wp:inline distT="0" distB="0" distL="0" distR="0" wp14:anchorId="42F1C4D7" wp14:editId="685BBA90">
             <wp:extent cx="5274310" cy="2985770"/>
             <wp:effectExtent l="0" t="0" r="2540" b="5080"/>
             <wp:docPr id="1913245222" name="图片 1"/>
@@ -3565,7 +3952,7 @@
                     <pic:cNvPicPr/>
                   </pic:nvPicPr>
                   <pic:blipFill>
-                    <a:blip r:embed="rId27"/>
+                    <a:blip r:embed="rId29"/>
                     <a:stretch>
                       <a:fillRect/>
                     </a:stretch>

</xml_diff>